<commit_message>
Results after IT corrections: 0 unresolved data errors, cohort 615 (416 vs 199)
Co-Authored-By: Claude Opus 5.5 <noreply@anthropic.com>
</commit_message>
<xml_diff>
--- a/results/table1.docx
+++ b/results/table1.docx
@@ -25,7 +25,7 @@
         <w:ind w:left="60" w:right="60" w:firstLine="0" w:firstLineChars="0"/>
       </w:pPr>
       <w:r>
-        <w:t xml:space="preserve">Table 1. Baseline characteristics by neoadjuvant anti-HER2 regimen [PRELIMINARY: 5 data-validation errors pending]. Synthetic data for teaching.</w:t>
+        <w:t xml:space="preserve">Table 1. Baseline characteristics by neoadjuvant anti-HER2 regimen. Synthetic data for teaching.</w:t>
       </w:r>
     </w:p>
     <w:tbl xmlns:a="http://schemas.openxmlformats.org/drawingml/2006/main" xmlns:pic="http://schemas.openxmlformats.org/drawingml/2006/picture">
@@ -190,7 +190,7 @@
                 <w:szCs w:val="16"/>
                 <w:color w:val="000000"/>
               </w:rPr>
-              <w:t xml:space="preserve">N = 613</w:t>
+              <w:t xml:space="preserve">N = 615</w:t>
             </w:r>
             <w:r>
               <w:rPr>
@@ -404,7 +404,7 @@
                 <w:szCs w:val="16"/>
                 <w:color w:val="000000"/>
               </w:rPr>
-              <w:t xml:space="preserve">N = 197</w:t>
+              <w:t xml:space="preserve">N = 199</w:t>
             </w:r>
             <w:r>
               <w:rPr>
@@ -600,7 +600,7 @@
                 <w:szCs w:val="16"/>
                 <w:color w:val="000000"/>
               </w:rPr>
-              <w:t xml:space="preserve">50.9 (43.6–58.4)</w:t>
+              <w:t xml:space="preserve">50.9 (43.5–58.4)</w:t>
             </w:r>
           </w:p>
         </w:tc>
@@ -708,7 +708,7 @@
                 <w:szCs w:val="16"/>
                 <w:color w:val="000000"/>
               </w:rPr>
-              <w:t xml:space="preserve">51.5 (42.6–57.6)</w:t>
+              <w:t xml:space="preserve">51.5 (42.6–57.7)</w:t>
             </w:r>
           </w:p>
         </w:tc>
@@ -1428,7 +1428,7 @@
                 <w:szCs w:val="16"/>
                 <w:color w:val="000000"/>
               </w:rPr>
-              <w:t xml:space="preserve">266 (43.4%)</w:t>
+              <w:t xml:space="preserve">267 (43.4%)</w:t>
             </w:r>
           </w:p>
         </w:tc>
@@ -1536,7 +1536,7 @@
                 <w:szCs w:val="16"/>
                 <w:color w:val="000000"/>
               </w:rPr>
-              <w:t xml:space="preserve">82 (41.6%)</w:t>
+              <w:t xml:space="preserve">83 (41.7%)</w:t>
             </w:r>
           </w:p>
         </w:tc>
@@ -1704,7 +1704,7 @@
                 <w:szCs w:val="16"/>
                 <w:color w:val="000000"/>
               </w:rPr>
-              <w:t xml:space="preserve">347 (56.6%)</w:t>
+              <w:t xml:space="preserve">348 (56.6%)</w:t>
             </w:r>
           </w:p>
         </w:tc>
@@ -1812,7 +1812,7 @@
                 <w:szCs w:val="16"/>
                 <w:color w:val="000000"/>
               </w:rPr>
-              <w:t xml:space="preserve">115 (58.4%)</w:t>
+              <w:t xml:space="preserve">116 (58.3%)</w:t>
             </w:r>
           </w:p>
         </w:tc>
@@ -2256,7 +2256,7 @@
                 <w:szCs w:val="16"/>
                 <w:color w:val="000000"/>
               </w:rPr>
-              <w:t xml:space="preserve">448 (73.1%)</w:t>
+              <w:t xml:space="preserve">450 (73.2%)</w:t>
             </w:r>
           </w:p>
         </w:tc>
@@ -2364,7 +2364,7 @@
                 <w:szCs w:val="16"/>
                 <w:color w:val="000000"/>
               </w:rPr>
-              <w:t xml:space="preserve">139 (70.6%)</w:t>
+              <w:t xml:space="preserve">141 (70.9%)</w:t>
             </w:r>
           </w:p>
         </w:tc>
@@ -2532,7 +2532,7 @@
                 <w:szCs w:val="16"/>
                 <w:color w:val="000000"/>
               </w:rPr>
-              <w:t xml:space="preserve">154 (25.1%)</w:t>
+              <w:t xml:space="preserve">154 (25.0%)</w:t>
             </w:r>
           </w:p>
         </w:tc>
@@ -2640,7 +2640,7 @@
                 <w:szCs w:val="16"/>
                 <w:color w:val="000000"/>
               </w:rPr>
-              <w:t xml:space="preserve">53 (26.9%)</w:t>
+              <w:t xml:space="preserve">53 (26.6%)</w:t>
             </w:r>
           </w:p>
         </w:tc>
@@ -3084,7 +3084,7 @@
                 <w:szCs w:val="16"/>
                 <w:color w:val="000000"/>
               </w:rPr>
-              <w:t xml:space="preserve">24.0 (21.3–26.7)</w:t>
+              <w:t xml:space="preserve">24.1 (21.3–26.7)</w:t>
             </w:r>
           </w:p>
         </w:tc>
@@ -3192,61 +3192,61 @@
                 <w:szCs w:val="16"/>
                 <w:color w:val="000000"/>
               </w:rPr>
-              <w:t xml:space="preserve">24.0 (21.2–26.3)</w:t>
-            </w:r>
-          </w:p>
-        </w:tc>
-        <w:tc>
-          <w:tcPr>
-            <w:tcBorders>
-              <w:bottom w:val="none" w:sz="0" w:space="0" w:color="000000"/>
-              <w:top w:val="none" w:sz="0" w:space="0" w:color="000000"/>
-              <w:left w:val="none" w:sz="0" w:space="0" w:color="000000"/>
-              <w:right w:val="none" w:sz="0" w:space="0" w:color="000000"/>
-            </w:tcBorders>
-            <w:shd w:val="clear" w:color="auto" w:fill="FFFFFF"/>
-            <w:tcMar>
-              <w:top w:w="0" w:type="dxa"/>
-              <w:bottom w:w="0" w:type="dxa"/>
-              <w:left w:w="0" w:type="dxa"/>
-              <w:right w:w="0" w:type="dxa"/>
-            </w:tcMar>
-            <w:vAlign w:val="top"/>
-          </w:tcPr>
-          <w:p>
-            <w:pPr>
-              <w:jc w:val="center"/>
-              <w:pBdr>
-                <w:bottom w:val="none" w:sz="0" w:space="0" w:color="000000"/>
-                <w:top w:val="none" w:sz="0" w:space="0" w:color="000000"/>
-                <w:left w:val="none" w:sz="0" w:space="0" w:color="000000"/>
-                <w:right w:val="none" w:sz="0" w:space="0" w:color="000000"/>
-              </w:pBdr>
-              <w:spacing w:after="20" w:before="20" w:line="240"/>
-              <w:ind w:left="100" w:right="100" w:firstLine="0" w:firstLineChars="0"/>
-              <w:rPr>
-                <w:rFonts w:ascii="Helvetica" w:hAnsi="Helvetica" w:eastAsia="Helvetica" w:cs="Helvetica"/>
-                <w:i w:val="false"/>
-                <w:b w:val="false"/>
-                <w:u w:val="none"/>
-                <w:strike w:val="false"/>
-                <w:sz w:val="16"/>
-                <w:szCs w:val="16"/>
-                <w:color w:val="000000"/>
-              </w:rPr>
-            </w:pPr>
-            <w:r>
-              <w:rPr>
-                <w:rFonts w:ascii="Helvetica" w:hAnsi="Helvetica" w:eastAsia="Helvetica" w:cs="Helvetica"/>
-                <w:i w:val="false"/>
-                <w:b w:val="false"/>
-                <w:u w:val="none"/>
-                <w:strike w:val="false"/>
-                <w:sz w:val="16"/>
-                <w:szCs w:val="16"/>
-                <w:color w:val="000000"/>
-              </w:rPr>
-              <w:t xml:space="preserve">0.10</w:t>
+              <w:t xml:space="preserve">24.0 (21.2–26.4)</w:t>
+            </w:r>
+          </w:p>
+        </w:tc>
+        <w:tc>
+          <w:tcPr>
+            <w:tcBorders>
+              <w:bottom w:val="none" w:sz="0" w:space="0" w:color="000000"/>
+              <w:top w:val="none" w:sz="0" w:space="0" w:color="000000"/>
+              <w:left w:val="none" w:sz="0" w:space="0" w:color="000000"/>
+              <w:right w:val="none" w:sz="0" w:space="0" w:color="000000"/>
+            </w:tcBorders>
+            <w:shd w:val="clear" w:color="auto" w:fill="FFFFFF"/>
+            <w:tcMar>
+              <w:top w:w="0" w:type="dxa"/>
+              <w:bottom w:w="0" w:type="dxa"/>
+              <w:left w:w="0" w:type="dxa"/>
+              <w:right w:w="0" w:type="dxa"/>
+            </w:tcMar>
+            <w:vAlign w:val="top"/>
+          </w:tcPr>
+          <w:p>
+            <w:pPr>
+              <w:jc w:val="center"/>
+              <w:pBdr>
+                <w:bottom w:val="none" w:sz="0" w:space="0" w:color="000000"/>
+                <w:top w:val="none" w:sz="0" w:space="0" w:color="000000"/>
+                <w:left w:val="none" w:sz="0" w:space="0" w:color="000000"/>
+                <w:right w:val="none" w:sz="0" w:space="0" w:color="000000"/>
+              </w:pBdr>
+              <w:spacing w:after="20" w:before="20" w:line="240"/>
+              <w:ind w:left="100" w:right="100" w:firstLine="0" w:firstLineChars="0"/>
+              <w:rPr>
+                <w:rFonts w:ascii="Helvetica" w:hAnsi="Helvetica" w:eastAsia="Helvetica" w:cs="Helvetica"/>
+                <w:i w:val="false"/>
+                <w:b w:val="false"/>
+                <w:u w:val="none"/>
+                <w:strike w:val="false"/>
+                <w:sz w:val="16"/>
+                <w:szCs w:val="16"/>
+                <w:color w:val="000000"/>
+              </w:rPr>
+            </w:pPr>
+            <w:r>
+              <w:rPr>
+                <w:rFonts w:ascii="Helvetica" w:hAnsi="Helvetica" w:eastAsia="Helvetica" w:cs="Helvetica"/>
+                <w:i w:val="false"/>
+                <w:b w:val="false"/>
+                <w:u w:val="none"/>
+                <w:strike w:val="false"/>
+                <w:sz w:val="16"/>
+                <w:szCs w:val="16"/>
+                <w:color w:val="000000"/>
+              </w:rPr>
+              <w:t xml:space="preserve">0.08</w:t>
             </w:r>
           </w:p>
         </w:tc>
@@ -3522,7 +3522,7 @@
                 <w:szCs w:val="16"/>
                 <w:color w:val="000000"/>
               </w:rPr>
-              <w:t xml:space="preserve">-0.09</w:t>
+              <w:t xml:space="preserve">-0.08</w:t>
             </w:r>
           </w:p>
         </w:tc>
@@ -3798,7 +3798,7 @@
                 <w:szCs w:val="16"/>
                 <w:color w:val="000000"/>
               </w:rPr>
-              <w:t xml:space="preserve">0.08</w:t>
+              <w:t xml:space="preserve">0.09</w:t>
             </w:r>
           </w:p>
         </w:tc>
@@ -4020,7 +4020,7 @@
                 <w:szCs w:val="16"/>
                 <w:color w:val="000000"/>
               </w:rPr>
-              <w:t xml:space="preserve">17 (8.6%)</w:t>
+              <w:t xml:space="preserve">17 (8.5%)</w:t>
             </w:r>
           </w:p>
         </w:tc>
@@ -4188,7 +4188,7 @@
                 <w:szCs w:val="16"/>
                 <w:color w:val="000000"/>
               </w:rPr>
-              <w:t xml:space="preserve">347 (56.6%)</w:t>
+              <w:t xml:space="preserve">348 (56.6%)</w:t>
             </w:r>
           </w:p>
         </w:tc>
@@ -4296,7 +4296,7 @@
                 <w:szCs w:val="16"/>
                 <w:color w:val="000000"/>
               </w:rPr>
-              <w:t xml:space="preserve">110 (55.8%)</w:t>
+              <w:t xml:space="preserve">111 (55.8%)</w:t>
             </w:r>
           </w:p>
         </w:tc>
@@ -4464,7 +4464,7 @@
                 <w:szCs w:val="16"/>
                 <w:color w:val="000000"/>
               </w:rPr>
-              <w:t xml:space="preserve">139 (22.7%)</w:t>
+              <w:t xml:space="preserve">139 (22.6%)</w:t>
             </w:r>
           </w:p>
         </w:tc>
@@ -4572,7 +4572,7 @@
                 <w:szCs w:val="16"/>
                 <w:color w:val="000000"/>
               </w:rPr>
-              <w:t xml:space="preserve">42 (21.3%)</w:t>
+              <w:t xml:space="preserve">42 (21.1%)</w:t>
             </w:r>
           </w:p>
         </w:tc>
@@ -4740,7 +4740,7 @@
                 <w:szCs w:val="16"/>
                 <w:color w:val="000000"/>
               </w:rPr>
-              <w:t xml:space="preserve">78 (12.7%)</w:t>
+              <w:t xml:space="preserve">79 (12.8%)</w:t>
             </w:r>
           </w:p>
         </w:tc>
@@ -4848,7 +4848,7 @@
                 <w:szCs w:val="16"/>
                 <w:color w:val="000000"/>
               </w:rPr>
-              <w:t xml:space="preserve">28 (14.2%)</w:t>
+              <w:t xml:space="preserve">29 (14.6%)</w:t>
             </w:r>
           </w:p>
         </w:tc>
@@ -5178,7 +5178,7 @@
                 <w:szCs w:val="16"/>
                 <w:color w:val="000000"/>
               </w:rPr>
-              <w:t xml:space="preserve">0.01</w:t>
+              <w:t xml:space="preserve">0.00</w:t>
             </w:r>
           </w:p>
         </w:tc>
@@ -5292,7 +5292,7 @@
                 <w:szCs w:val="16"/>
                 <w:color w:val="000000"/>
               </w:rPr>
-              <w:t xml:space="preserve">179 (29.2%)</w:t>
+              <w:t xml:space="preserve">180 (29.3%)</w:t>
             </w:r>
           </w:p>
         </w:tc>
@@ -5400,7 +5400,7 @@
                 <w:szCs w:val="16"/>
                 <w:color w:val="000000"/>
               </w:rPr>
-              <w:t xml:space="preserve">57 (28.9%)</w:t>
+              <w:t xml:space="preserve">58 (29.1%)</w:t>
             </w:r>
           </w:p>
         </w:tc>
@@ -5568,7 +5568,7 @@
                 <w:szCs w:val="16"/>
                 <w:color w:val="000000"/>
               </w:rPr>
-              <w:t xml:space="preserve">290 (47.3%)</w:t>
+              <w:t xml:space="preserve">290 (47.2%)</w:t>
             </w:r>
           </w:p>
         </w:tc>
@@ -5676,7 +5676,7 @@
                 <w:szCs w:val="16"/>
                 <w:color w:val="000000"/>
               </w:rPr>
-              <w:t xml:space="preserve">94 (47.7%)</w:t>
+              <w:t xml:space="preserve">94 (47.2%)</w:t>
             </w:r>
           </w:p>
         </w:tc>
@@ -5844,7 +5844,7 @@
                 <w:szCs w:val="16"/>
                 <w:color w:val="000000"/>
               </w:rPr>
-              <w:t xml:space="preserve">82 (13.4%)</w:t>
+              <w:t xml:space="preserve">83 (13.5%)</w:t>
             </w:r>
           </w:p>
         </w:tc>
@@ -5952,7 +5952,7 @@
                 <w:szCs w:val="16"/>
                 <w:color w:val="000000"/>
               </w:rPr>
-              <w:t xml:space="preserve">26 (13.2%)</w:t>
+              <w:t xml:space="preserve">27 (13.6%)</w:t>
             </w:r>
           </w:p>
         </w:tc>
@@ -6228,7 +6228,7 @@
                 <w:szCs w:val="16"/>
                 <w:color w:val="000000"/>
               </w:rPr>
-              <w:t xml:space="preserve">20 (10.2%)</w:t>
+              <w:t xml:space="preserve">20 (10.1%)</w:t>
             </w:r>
           </w:p>
         </w:tc>
@@ -6558,7 +6558,7 @@
                 <w:szCs w:val="16"/>
                 <w:color w:val="000000"/>
               </w:rPr>
-              <w:t xml:space="preserve">0.09</w:t>
+              <w:t xml:space="preserve">0.10</w:t>
             </w:r>
           </w:p>
         </w:tc>
@@ -6672,7 +6672,7 @@
                 <w:szCs w:val="16"/>
                 <w:color w:val="000000"/>
               </w:rPr>
-              <w:t xml:space="preserve">139 (22.7%)</w:t>
+              <w:t xml:space="preserve">139 (22.6%)</w:t>
             </w:r>
           </w:p>
         </w:tc>
@@ -6780,7 +6780,7 @@
                 <w:szCs w:val="16"/>
                 <w:color w:val="000000"/>
               </w:rPr>
-              <w:t xml:space="preserve">45 (22.8%)</w:t>
+              <w:t xml:space="preserve">45 (22.6%)</w:t>
             </w:r>
           </w:p>
         </w:tc>
@@ -6948,7 +6948,7 @@
                 <w:szCs w:val="16"/>
                 <w:color w:val="000000"/>
               </w:rPr>
-              <w:t xml:space="preserve">208 (33.9%)</w:t>
+              <w:t xml:space="preserve">208 (33.8%)</w:t>
             </w:r>
           </w:p>
         </w:tc>
@@ -7056,7 +7056,7 @@
                 <w:szCs w:val="16"/>
                 <w:color w:val="000000"/>
               </w:rPr>
-              <w:t xml:space="preserve">67 (34.0%)</w:t>
+              <w:t xml:space="preserve">67 (33.7%)</w:t>
             </w:r>
           </w:p>
         </w:tc>
@@ -7224,7 +7224,7 @@
                 <w:szCs w:val="16"/>
                 <w:color w:val="000000"/>
               </w:rPr>
-              <w:t xml:space="preserve">133 (21.7%)</w:t>
+              <w:t xml:space="preserve">134 (21.8%)</w:t>
             </w:r>
           </w:p>
         </w:tc>
@@ -7332,7 +7332,7 @@
                 <w:szCs w:val="16"/>
                 <w:color w:val="000000"/>
               </w:rPr>
-              <w:t xml:space="preserve">39 (19.8%)</w:t>
+              <w:t xml:space="preserve">40 (20.1%)</w:t>
             </w:r>
           </w:p>
         </w:tc>
@@ -7500,7 +7500,7 @@
                 <w:szCs w:val="16"/>
                 <w:color w:val="000000"/>
               </w:rPr>
-              <w:t xml:space="preserve">71 (11.6%)</w:t>
+              <w:t xml:space="preserve">72 (11.7%)</w:t>
             </w:r>
           </w:p>
         </w:tc>
@@ -7608,7 +7608,7 @@
                 <w:szCs w:val="16"/>
                 <w:color w:val="000000"/>
               </w:rPr>
-              <w:t xml:space="preserve">26 (13.2%)</w:t>
+              <w:t xml:space="preserve">27 (13.6%)</w:t>
             </w:r>
           </w:p>
         </w:tc>
@@ -7884,7 +7884,7 @@
                 <w:szCs w:val="16"/>
                 <w:color w:val="000000"/>
               </w:rPr>
-              <w:t xml:space="preserve">20 (10.2%)</w:t>
+              <w:t xml:space="preserve">20 (10.1%)</w:t>
             </w:r>
           </w:p>
         </w:tc>
@@ -8328,7 +8328,7 @@
                 <w:szCs w:val="16"/>
                 <w:color w:val="000000"/>
               </w:rPr>
-              <w:t xml:space="preserve">355 (57.9%)</w:t>
+              <w:t xml:space="preserve">356 (57.9%)</w:t>
             </w:r>
           </w:p>
         </w:tc>
@@ -8436,7 +8436,7 @@
                 <w:szCs w:val="16"/>
                 <w:color w:val="000000"/>
               </w:rPr>
-              <w:t xml:space="preserve">115 (58.4%)</w:t>
+              <w:t xml:space="preserve">116 (58.3%)</w:t>
             </w:r>
           </w:p>
         </w:tc>
@@ -8604,7 +8604,7 @@
                 <w:szCs w:val="16"/>
                 <w:color w:val="000000"/>
               </w:rPr>
-              <w:t xml:space="preserve">258 (42.1%)</w:t>
+              <w:t xml:space="preserve">259 (42.1%)</w:t>
             </w:r>
           </w:p>
         </w:tc>
@@ -8712,7 +8712,7 @@
                 <w:szCs w:val="16"/>
                 <w:color w:val="000000"/>
               </w:rPr>
-              <w:t xml:space="preserve">82 (41.6%)</w:t>
+              <w:t xml:space="preserve">83 (41.7%)</w:t>
             </w:r>
           </w:p>
         </w:tc>
@@ -9156,7 +9156,7 @@
                 <w:szCs w:val="16"/>
                 <w:color w:val="000000"/>
               </w:rPr>
-              <w:t xml:space="preserve">473 (77.2%)</w:t>
+              <w:t xml:space="preserve">475 (77.2%)</w:t>
             </w:r>
           </w:p>
         </w:tc>
@@ -9264,7 +9264,7 @@
                 <w:szCs w:val="16"/>
                 <w:color w:val="000000"/>
               </w:rPr>
-              <w:t xml:space="preserve">153 (77.7%)</w:t>
+              <w:t xml:space="preserve">155 (77.9%)</w:t>
             </w:r>
           </w:p>
         </w:tc>
@@ -9540,7 +9540,7 @@
                 <w:szCs w:val="16"/>
                 <w:color w:val="000000"/>
               </w:rPr>
-              <w:t xml:space="preserve">44 (22.3%)</w:t>
+              <w:t xml:space="preserve">44 (22.1%)</w:t>
             </w:r>
           </w:p>
         </w:tc>
@@ -9870,7 +9870,7 @@
                 <w:szCs w:val="16"/>
                 <w:color w:val="000000"/>
               </w:rPr>
-              <w:t xml:space="preserve">0.08</w:t>
+              <w:t xml:space="preserve">0.07</w:t>
             </w:r>
           </w:p>
         </w:tc>
@@ -10260,7 +10260,7 @@
                 <w:szCs w:val="16"/>
                 <w:color w:val="000000"/>
               </w:rPr>
-              <w:t xml:space="preserve">257 (45.4%)</w:t>
+              <w:t xml:space="preserve">257 (45.2%)</w:t>
             </w:r>
           </w:p>
         </w:tc>
@@ -10368,7 +10368,7 @@
                 <w:szCs w:val="16"/>
                 <w:color w:val="000000"/>
               </w:rPr>
-              <w:t xml:space="preserve">86 (48.0%)</w:t>
+              <w:t xml:space="preserve">86 (47.5%)</w:t>
             </w:r>
           </w:p>
         </w:tc>
@@ -10536,7 +10536,7 @@
                 <w:szCs w:val="16"/>
                 <w:color w:val="000000"/>
               </w:rPr>
-              <w:t xml:space="preserve">287 (50.7%)</w:t>
+              <w:t xml:space="preserve">289 (50.9%)</w:t>
             </w:r>
           </w:p>
         </w:tc>
@@ -10644,7 +10644,7 @@
                 <w:szCs w:val="16"/>
                 <w:color w:val="000000"/>
               </w:rPr>
-              <w:t xml:space="preserve">86 (48.0%)</w:t>
+              <w:t xml:space="preserve">88 (48.6%)</w:t>
             </w:r>
           </w:p>
         </w:tc>
@@ -11088,60 +11088,6 @@
                 <w:szCs w:val="16"/>
                 <w:color w:val="000000"/>
               </w:rPr>
-              <w:t xml:space="preserve">44.0 (31.0–56.0)</w:t>
-            </w:r>
-          </w:p>
-        </w:tc>
-        <w:tc>
-          <w:tcPr>
-            <w:tcBorders>
-              <w:bottom w:val="none" w:sz="0" w:space="0" w:color="000000"/>
-              <w:top w:val="none" w:sz="0" w:space="0" w:color="000000"/>
-              <w:left w:val="none" w:sz="0" w:space="0" w:color="000000"/>
-              <w:right w:val="none" w:sz="0" w:space="0" w:color="000000"/>
-            </w:tcBorders>
-            <w:shd w:val="clear" w:color="auto" w:fill="FFFFFF"/>
-            <w:tcMar>
-              <w:top w:w="0" w:type="dxa"/>
-              <w:bottom w:w="0" w:type="dxa"/>
-              <w:left w:w="0" w:type="dxa"/>
-              <w:right w:w="0" w:type="dxa"/>
-            </w:tcMar>
-            <w:vAlign w:val="top"/>
-          </w:tcPr>
-          <w:p>
-            <w:pPr>
-              <w:jc w:val="center"/>
-              <w:pBdr>
-                <w:bottom w:val="none" w:sz="0" w:space="0" w:color="000000"/>
-                <w:top w:val="none" w:sz="0" w:space="0" w:color="000000"/>
-                <w:left w:val="none" w:sz="0" w:space="0" w:color="000000"/>
-                <w:right w:val="none" w:sz="0" w:space="0" w:color="000000"/>
-              </w:pBdr>
-              <w:spacing w:after="20" w:before="20" w:line="240"/>
-              <w:ind w:left="100" w:right="100" w:firstLine="0" w:firstLineChars="0"/>
-              <w:rPr>
-                <w:rFonts w:ascii="Helvetica" w:hAnsi="Helvetica" w:eastAsia="Helvetica" w:cs="Helvetica"/>
-                <w:i w:val="false"/>
-                <w:b w:val="false"/>
-                <w:u w:val="none"/>
-                <w:strike w:val="false"/>
-                <w:sz w:val="16"/>
-                <w:szCs w:val="16"/>
-                <w:color w:val="000000"/>
-              </w:rPr>
-            </w:pPr>
-            <w:r>
-              <w:rPr>
-                <w:rFonts w:ascii="Helvetica" w:hAnsi="Helvetica" w:eastAsia="Helvetica" w:cs="Helvetica"/>
-                <w:i w:val="false"/>
-                <w:b w:val="false"/>
-                <w:u w:val="none"/>
-                <w:strike w:val="false"/>
-                <w:sz w:val="16"/>
-                <w:szCs w:val="16"/>
-                <w:color w:val="000000"/>
-              </w:rPr>
               <w:t xml:space="preserve">43.5 (31.0–56.0)</w:t>
             </w:r>
           </w:p>
@@ -11196,61 +11142,115 @@
                 <w:szCs w:val="16"/>
                 <w:color w:val="000000"/>
               </w:rPr>
-              <w:t xml:space="preserve">44.0 (30.0–57.5)</w:t>
-            </w:r>
-          </w:p>
-        </w:tc>
-        <w:tc>
-          <w:tcPr>
-            <w:tcBorders>
-              <w:bottom w:val="none" w:sz="0" w:space="0" w:color="000000"/>
-              <w:top w:val="none" w:sz="0" w:space="0" w:color="000000"/>
-              <w:left w:val="none" w:sz="0" w:space="0" w:color="000000"/>
-              <w:right w:val="none" w:sz="0" w:space="0" w:color="000000"/>
-            </w:tcBorders>
-            <w:shd w:val="clear" w:color="auto" w:fill="FFFFFF"/>
-            <w:tcMar>
-              <w:top w:w="0" w:type="dxa"/>
-              <w:bottom w:w="0" w:type="dxa"/>
-              <w:left w:w="0" w:type="dxa"/>
-              <w:right w:w="0" w:type="dxa"/>
-            </w:tcMar>
-            <w:vAlign w:val="top"/>
-          </w:tcPr>
-          <w:p>
-            <w:pPr>
-              <w:jc w:val="center"/>
-              <w:pBdr>
-                <w:bottom w:val="none" w:sz="0" w:space="0" w:color="000000"/>
-                <w:top w:val="none" w:sz="0" w:space="0" w:color="000000"/>
-                <w:left w:val="none" w:sz="0" w:space="0" w:color="000000"/>
-                <w:right w:val="none" w:sz="0" w:space="0" w:color="000000"/>
-              </w:pBdr>
-              <w:spacing w:after="20" w:before="20" w:line="240"/>
-              <w:ind w:left="100" w:right="100" w:firstLine="0" w:firstLineChars="0"/>
-              <w:rPr>
-                <w:rFonts w:ascii="Helvetica" w:hAnsi="Helvetica" w:eastAsia="Helvetica" w:cs="Helvetica"/>
-                <w:i w:val="false"/>
-                <w:b w:val="false"/>
-                <w:u w:val="none"/>
-                <w:strike w:val="false"/>
-                <w:sz w:val="16"/>
-                <w:szCs w:val="16"/>
-                <w:color w:val="000000"/>
-              </w:rPr>
-            </w:pPr>
-            <w:r>
-              <w:rPr>
-                <w:rFonts w:ascii="Helvetica" w:hAnsi="Helvetica" w:eastAsia="Helvetica" w:cs="Helvetica"/>
-                <w:i w:val="false"/>
-                <w:b w:val="false"/>
-                <w:u w:val="none"/>
-                <w:strike w:val="false"/>
-                <w:sz w:val="16"/>
-                <w:szCs w:val="16"/>
-                <w:color w:val="000000"/>
-              </w:rPr>
-              <w:t xml:space="preserve">-0.06</w:t>
+              <w:t xml:space="preserve">43.5 (31.0–56.0)</w:t>
+            </w:r>
+          </w:p>
+        </w:tc>
+        <w:tc>
+          <w:tcPr>
+            <w:tcBorders>
+              <w:bottom w:val="none" w:sz="0" w:space="0" w:color="000000"/>
+              <w:top w:val="none" w:sz="0" w:space="0" w:color="000000"/>
+              <w:left w:val="none" w:sz="0" w:space="0" w:color="000000"/>
+              <w:right w:val="none" w:sz="0" w:space="0" w:color="000000"/>
+            </w:tcBorders>
+            <w:shd w:val="clear" w:color="auto" w:fill="FFFFFF"/>
+            <w:tcMar>
+              <w:top w:w="0" w:type="dxa"/>
+              <w:bottom w:w="0" w:type="dxa"/>
+              <w:left w:w="0" w:type="dxa"/>
+              <w:right w:w="0" w:type="dxa"/>
+            </w:tcMar>
+            <w:vAlign w:val="top"/>
+          </w:tcPr>
+          <w:p>
+            <w:pPr>
+              <w:jc w:val="center"/>
+              <w:pBdr>
+                <w:bottom w:val="none" w:sz="0" w:space="0" w:color="000000"/>
+                <w:top w:val="none" w:sz="0" w:space="0" w:color="000000"/>
+                <w:left w:val="none" w:sz="0" w:space="0" w:color="000000"/>
+                <w:right w:val="none" w:sz="0" w:space="0" w:color="000000"/>
+              </w:pBdr>
+              <w:spacing w:after="20" w:before="20" w:line="240"/>
+              <w:ind w:left="100" w:right="100" w:firstLine="0" w:firstLineChars="0"/>
+              <w:rPr>
+                <w:rFonts w:ascii="Helvetica" w:hAnsi="Helvetica" w:eastAsia="Helvetica" w:cs="Helvetica"/>
+                <w:i w:val="false"/>
+                <w:b w:val="false"/>
+                <w:u w:val="none"/>
+                <w:strike w:val="false"/>
+                <w:sz w:val="16"/>
+                <w:szCs w:val="16"/>
+                <w:color w:val="000000"/>
+              </w:rPr>
+            </w:pPr>
+            <w:r>
+              <w:rPr>
+                <w:rFonts w:ascii="Helvetica" w:hAnsi="Helvetica" w:eastAsia="Helvetica" w:cs="Helvetica"/>
+                <w:i w:val="false"/>
+                <w:b w:val="false"/>
+                <w:u w:val="none"/>
+                <w:strike w:val="false"/>
+                <w:sz w:val="16"/>
+                <w:szCs w:val="16"/>
+                <w:color w:val="000000"/>
+              </w:rPr>
+              <w:t xml:space="preserve">43.5 (30.0–57.0)</w:t>
+            </w:r>
+          </w:p>
+        </w:tc>
+        <w:tc>
+          <w:tcPr>
+            <w:tcBorders>
+              <w:bottom w:val="none" w:sz="0" w:space="0" w:color="000000"/>
+              <w:top w:val="none" w:sz="0" w:space="0" w:color="000000"/>
+              <w:left w:val="none" w:sz="0" w:space="0" w:color="000000"/>
+              <w:right w:val="none" w:sz="0" w:space="0" w:color="000000"/>
+            </w:tcBorders>
+            <w:shd w:val="clear" w:color="auto" w:fill="FFFFFF"/>
+            <w:tcMar>
+              <w:top w:w="0" w:type="dxa"/>
+              <w:bottom w:w="0" w:type="dxa"/>
+              <w:left w:w="0" w:type="dxa"/>
+              <w:right w:w="0" w:type="dxa"/>
+            </w:tcMar>
+            <w:vAlign w:val="top"/>
+          </w:tcPr>
+          <w:p>
+            <w:pPr>
+              <w:jc w:val="center"/>
+              <w:pBdr>
+                <w:bottom w:val="none" w:sz="0" w:space="0" w:color="000000"/>
+                <w:top w:val="none" w:sz="0" w:space="0" w:color="000000"/>
+                <w:left w:val="none" w:sz="0" w:space="0" w:color="000000"/>
+                <w:right w:val="none" w:sz="0" w:space="0" w:color="000000"/>
+              </w:pBdr>
+              <w:spacing w:after="20" w:before="20" w:line="240"/>
+              <w:ind w:left="100" w:right="100" w:firstLine="0" w:firstLineChars="0"/>
+              <w:rPr>
+                <w:rFonts w:ascii="Helvetica" w:hAnsi="Helvetica" w:eastAsia="Helvetica" w:cs="Helvetica"/>
+                <w:i w:val="false"/>
+                <w:b w:val="false"/>
+                <w:u w:val="none"/>
+                <w:strike w:val="false"/>
+                <w:sz w:val="16"/>
+                <w:szCs w:val="16"/>
+                <w:color w:val="000000"/>
+              </w:rPr>
+            </w:pPr>
+            <w:r>
+              <w:rPr>
+                <w:rFonts w:ascii="Helvetica" w:hAnsi="Helvetica" w:eastAsia="Helvetica" w:cs="Helvetica"/>
+                <w:i w:val="false"/>
+                <w:b w:val="false"/>
+                <w:u w:val="none"/>
+                <w:strike w:val="false"/>
+                <w:sz w:val="16"/>
+                <w:szCs w:val="16"/>
+                <w:color w:val="000000"/>
+              </w:rPr>
+              <w:t xml:space="preserve">-0.05</w:t>
             </w:r>
           </w:p>
         </w:tc>
@@ -11802,7 +11802,7 @@
                 <w:szCs w:val="16"/>
                 <w:color w:val="000000"/>
               </w:rPr>
-              <w:t xml:space="preserve">0.54</w:t>
+              <w:t xml:space="preserve">0.55</w:t>
             </w:r>
           </w:p>
         </w:tc>
@@ -11916,7 +11916,7 @@
                 <w:szCs w:val="16"/>
                 <w:color w:val="000000"/>
               </w:rPr>
-              <w:t xml:space="preserve">221 (36.1%)</w:t>
+              <w:t xml:space="preserve">223 (36.3%)</w:t>
             </w:r>
           </w:p>
         </w:tc>
@@ -12024,7 +12024,7 @@
                 <w:szCs w:val="16"/>
                 <w:color w:val="000000"/>
               </w:rPr>
-              <w:t xml:space="preserve">105 (53.3%)</w:t>
+              <w:t xml:space="preserve">107 (53.8%)</w:t>
             </w:r>
           </w:p>
         </w:tc>
@@ -12192,7 +12192,7 @@
                 <w:szCs w:val="16"/>
                 <w:color w:val="000000"/>
               </w:rPr>
-              <w:t xml:space="preserve">392 (63.9%)</w:t>
+              <w:t xml:space="preserve">392 (63.7%)</w:t>
             </w:r>
           </w:p>
         </w:tc>
@@ -12300,7 +12300,7 @@
                 <w:szCs w:val="16"/>
                 <w:color w:val="000000"/>
               </w:rPr>
-              <w:t xml:space="preserve">92 (46.7%)</w:t>
+              <w:t xml:space="preserve">92 (46.2%)</w:t>
             </w:r>
           </w:p>
         </w:tc>
@@ -12630,7 +12630,7 @@
                 <w:szCs w:val="16"/>
                 <w:color w:val="000000"/>
               </w:rPr>
-              <w:t xml:space="preserve">2.79</w:t>
+              <w:t xml:space="preserve">2.80</w:t>
             </w:r>
           </w:p>
         </w:tc>
@@ -12744,7 +12744,7 @@
                 <w:szCs w:val="16"/>
                 <w:color w:val="000000"/>
               </w:rPr>
-              <w:t xml:space="preserve">160 (26.1%)</w:t>
+              <w:t xml:space="preserve">162 (26.3%)</w:t>
             </w:r>
           </w:p>
         </w:tc>
@@ -12852,7 +12852,7 @@
                 <w:szCs w:val="16"/>
                 <w:color w:val="000000"/>
               </w:rPr>
-              <w:t xml:space="preserve">154 (78.2%)</w:t>
+              <w:t xml:space="preserve">156 (78.4%)</w:t>
             </w:r>
           </w:p>
         </w:tc>
@@ -13020,7 +13020,7 @@
                 <w:szCs w:val="16"/>
                 <w:color w:val="000000"/>
               </w:rPr>
-              <w:t xml:space="preserve">209 (34.1%)</w:t>
+              <w:t xml:space="preserve">209 (34.0%)</w:t>
             </w:r>
           </w:p>
         </w:tc>
@@ -13128,7 +13128,7 @@
                 <w:szCs w:val="16"/>
                 <w:color w:val="000000"/>
               </w:rPr>
-              <w:t xml:space="preserve">38 (19.3%)</w:t>
+              <w:t xml:space="preserve">38 (19.1%)</w:t>
             </w:r>
           </w:p>
         </w:tc>
@@ -13296,7 +13296,7 @@
                 <w:szCs w:val="16"/>
                 <w:color w:val="000000"/>
               </w:rPr>
-              <w:t xml:space="preserve">244 (39.8%)</w:t>
+              <w:t xml:space="preserve">244 (39.7%)</w:t>
             </w:r>
           </w:p>
         </w:tc>

</xml_diff>